<commit_message>
fix documentaton and llm_provid...
</commit_message>
<xml_diff>
--- a/Официальная техническая документация.docx
+++ b/Официальная техническая документация.docx
@@ -325,29 +325,13 @@
           <w:b/>
           <w:bCs/>
         </w:rPr>
-        <w:t>UX/UI</w:t>
-      </w:r>
-      <w:proofErr w:type="gramStart"/>
-      <w:r>
-        <w:rPr>
-          <w:rFonts w:ascii="Times New Roman" w:hAnsi="Times New Roman" w:cs="Times New Roman"/>
-          <w:b/>
-          <w:bCs/>
-        </w:rPr>
-        <w:t>:</w:t>
-      </w:r>
-      <w:r>
-        <w:rPr>
-          <w:rFonts w:ascii="Times New Roman" w:hAnsi="Times New Roman" w:cs="Times New Roman"/>
-        </w:rPr>
-        <w:t xml:space="preserve"> Интуитивно</w:t>
-      </w:r>
-      <w:proofErr w:type="gramEnd"/>
-      <w:r>
-        <w:rPr>
-          <w:rFonts w:ascii="Times New Roman" w:hAnsi="Times New Roman" w:cs="Times New Roman"/>
-        </w:rPr>
-        <w:t xml:space="preserve"> понятный интерфейс.</w:t>
+        <w:t>UX/UI:</w:t>
+      </w:r>
+      <w:r>
+        <w:rPr>
+          <w:rFonts w:ascii="Times New Roman" w:hAnsi="Times New Roman" w:cs="Times New Roman"/>
+        </w:rPr>
+        <w:t xml:space="preserve"> Интуитивно понятный интерфейс.</w:t>
       </w:r>
     </w:p>
     <w:p>
@@ -530,17 +514,9 @@
         <w:rPr>
           <w:rFonts w:ascii="Times New Roman" w:hAnsi="Times New Roman" w:cs="Times New Roman"/>
         </w:rPr>
-        <w:t>llm_</w:t>
-      </w:r>
-      <w:proofErr w:type="gramStart"/>
-      <w:r>
-        <w:rPr>
-          <w:rFonts w:ascii="Times New Roman" w:hAnsi="Times New Roman" w:cs="Times New Roman"/>
-        </w:rPr>
-        <w:t>providers.json</w:t>
-      </w:r>
-      <w:proofErr w:type="spellEnd"/>
-      <w:proofErr w:type="gramEnd"/>
+        <w:t>llm_providers.json</w:t>
+      </w:r>
+      <w:proofErr w:type="spellEnd"/>
       <w:r>
         <w:rPr>
           <w:rFonts w:ascii="Times New Roman" w:hAnsi="Times New Roman" w:cs="Times New Roman"/>
@@ -773,17 +749,9 @@
         <w:rPr>
           <w:rFonts w:ascii="Times New Roman" w:hAnsi="Times New Roman" w:cs="Times New Roman"/>
         </w:rPr>
-        <w:t>llm_</w:t>
-      </w:r>
-      <w:proofErr w:type="gramStart"/>
-      <w:r>
-        <w:rPr>
-          <w:rFonts w:ascii="Times New Roman" w:hAnsi="Times New Roman" w:cs="Times New Roman"/>
-        </w:rPr>
-        <w:t>providers.json</w:t>
-      </w:r>
-      <w:proofErr w:type="spellEnd"/>
-      <w:proofErr w:type="gramEnd"/>
+        <w:t>llm_providers.json</w:t>
+      </w:r>
+      <w:proofErr w:type="spellEnd"/>
       <w:r>
         <w:rPr>
           <w:rFonts w:ascii="Times New Roman" w:hAnsi="Times New Roman" w:cs="Times New Roman"/>
@@ -1333,29 +1301,13 @@
           <w:b/>
           <w:bCs/>
         </w:rPr>
-        <w:t>Видеокарта (GPU)</w:t>
-      </w:r>
-      <w:proofErr w:type="gramStart"/>
-      <w:r>
-        <w:rPr>
-          <w:rFonts w:ascii="Times New Roman" w:hAnsi="Times New Roman" w:cs="Times New Roman"/>
-          <w:b/>
-          <w:bCs/>
-        </w:rPr>
-        <w:t>:</w:t>
-      </w:r>
-      <w:r>
-        <w:rPr>
-          <w:rFonts w:ascii="Times New Roman" w:hAnsi="Times New Roman" w:cs="Times New Roman"/>
-        </w:rPr>
-        <w:t xml:space="preserve"> От</w:t>
-      </w:r>
-      <w:proofErr w:type="gramEnd"/>
-      <w:r>
-        <w:rPr>
-          <w:rFonts w:ascii="Times New Roman" w:hAnsi="Times New Roman" w:cs="Times New Roman"/>
-        </w:rPr>
-        <w:t xml:space="preserve"> NVIDIA GTX 1660 </w:t>
+        <w:t>Видеокарта (GPU):</w:t>
+      </w:r>
+      <w:r>
+        <w:rPr>
+          <w:rFonts w:ascii="Times New Roman" w:hAnsi="Times New Roman" w:cs="Times New Roman"/>
+        </w:rPr>
+        <w:t xml:space="preserve"> От NVIDIA GTX 1660 </w:t>
       </w:r>
       <w:proofErr w:type="spellStart"/>
       <w:r>
@@ -1718,7 +1670,6 @@
         <w:t xml:space="preserve">(для </w:t>
       </w:r>
       <w:proofErr w:type="spellStart"/>
-      <w:proofErr w:type="gramStart"/>
       <w:r>
         <w:rPr>
           <w:rFonts w:ascii="Times New Roman" w:hAnsi="Times New Roman" w:cs="Times New Roman"/>
@@ -1726,7 +1677,6 @@
         <w:t>того,чтобы</w:t>
       </w:r>
       <w:proofErr w:type="spellEnd"/>
-      <w:proofErr w:type="gramEnd"/>
       <w:r>
         <w:rPr>
           <w:rFonts w:ascii="Times New Roman" w:hAnsi="Times New Roman" w:cs="Times New Roman"/>
@@ -2362,29 +2312,13 @@
           <w:b/>
           <w:bCs/>
         </w:rPr>
-        <w:t>ПРЕДУПРЕЖДЕНИЕ О ЛИМИТАХ</w:t>
-      </w:r>
-      <w:proofErr w:type="gramStart"/>
-      <w:r>
-        <w:rPr>
-          <w:rFonts w:ascii="Times New Roman" w:hAnsi="Times New Roman" w:cs="Times New Roman"/>
-          <w:b/>
-          <w:bCs/>
-        </w:rPr>
-        <w:t>:</w:t>
-      </w:r>
-      <w:r>
-        <w:rPr>
-          <w:rFonts w:ascii="Times New Roman" w:hAnsi="Times New Roman" w:cs="Times New Roman"/>
-        </w:rPr>
-        <w:t xml:space="preserve"> При</w:t>
-      </w:r>
-      <w:proofErr w:type="gramEnd"/>
-      <w:r>
-        <w:rPr>
-          <w:rFonts w:ascii="Times New Roman" w:hAnsi="Times New Roman" w:cs="Times New Roman"/>
-        </w:rPr>
-        <w:t xml:space="preserve"> работе с бесплатными внешними API (например, </w:t>
+        <w:t>ПРЕДУПРЕЖДЕНИЕ О ЛИМИТАХ:</w:t>
+      </w:r>
+      <w:r>
+        <w:rPr>
+          <w:rFonts w:ascii="Times New Roman" w:hAnsi="Times New Roman" w:cs="Times New Roman"/>
+        </w:rPr>
+        <w:t xml:space="preserve"> При работе с бесплатными внешними API (например, </w:t>
       </w:r>
       <w:proofErr w:type="spellStart"/>
       <w:r>
@@ -2494,7 +2428,7 @@
           <w:i/>
           <w:iCs/>
         </w:rPr>
-        <w:t>"Моя лока</w:t>
+        <w:t>"</w:t>
       </w:r>
       <w:r>
         <w:rPr>
@@ -2502,7 +2436,7 @@
           <w:i/>
           <w:iCs/>
         </w:rPr>
-        <w:t>льная сеть</w:t>
+        <w:t>м</w:t>
       </w:r>
       <w:r>
         <w:rPr>
@@ -2510,13 +2444,7 @@
           <w:i/>
           <w:iCs/>
         </w:rPr>
-        <w:t>"</w:t>
-      </w:r>
-      <w:r>
-        <w:rPr>
-          <w:rFonts w:ascii="Times New Roman" w:hAnsi="Times New Roman" w:cs="Times New Roman"/>
-        </w:rPr>
-        <w:t xml:space="preserve">, </w:t>
+        <w:t>оя лока</w:t>
       </w:r>
       <w:r>
         <w:rPr>
@@ -2524,16 +2452,47 @@
           <w:i/>
           <w:iCs/>
         </w:rPr>
-        <w:t>"</w:t>
-      </w:r>
-      <w:proofErr w:type="spellStart"/>
+        <w:t>льная сеть</w:t>
+      </w:r>
       <w:r>
         <w:rPr>
           <w:rFonts w:ascii="Times New Roman" w:hAnsi="Times New Roman" w:cs="Times New Roman"/>
           <w:i/>
           <w:iCs/>
         </w:rPr>
-        <w:t>Groq</w:t>
+        <w:t>"</w:t>
+      </w:r>
+      <w:r>
+        <w:rPr>
+          <w:rFonts w:ascii="Times New Roman" w:hAnsi="Times New Roman" w:cs="Times New Roman"/>
+        </w:rPr>
+        <w:t xml:space="preserve">, </w:t>
+      </w:r>
+      <w:r>
+        <w:rPr>
+          <w:rFonts w:ascii="Times New Roman" w:hAnsi="Times New Roman" w:cs="Times New Roman"/>
+          <w:i/>
+          <w:iCs/>
+        </w:rPr>
+        <w:t>"</w:t>
+      </w:r>
+      <w:r>
+        <w:rPr>
+          <w:rFonts w:ascii="Times New Roman" w:hAnsi="Times New Roman" w:cs="Times New Roman"/>
+          <w:i/>
+          <w:iCs/>
+          <w:lang w:val="en-US"/>
+        </w:rPr>
+        <w:t>g</w:t>
+      </w:r>
+      <w:proofErr w:type="spellStart"/>
+      <w:r>
+        <w:rPr>
+          <w:rFonts w:ascii="Times New Roman" w:hAnsi="Times New Roman" w:cs="Times New Roman"/>
+          <w:i/>
+          <w:iCs/>
+        </w:rPr>
+        <w:t>roq</w:t>
       </w:r>
       <w:proofErr w:type="spellEnd"/>
       <w:r>
@@ -2745,22 +2704,10 @@
           <w:b/>
           <w:bCs/>
         </w:rPr>
-        <w:t>Стандартный</w:t>
-      </w:r>
-      <w:proofErr w:type="gramStart"/>
-      <w:r>
-        <w:rPr>
-          <w:b/>
-          <w:bCs/>
-        </w:rPr>
-        <w:t>:</w:t>
-      </w:r>
-      <w:r>
-        <w:t xml:space="preserve"> Используется</w:t>
-      </w:r>
-      <w:proofErr w:type="gramEnd"/>
-      <w:r>
-        <w:t xml:space="preserve"> для локальных сетей (</w:t>
+        <w:t>Стандартный:</w:t>
+      </w:r>
+      <w:r>
+        <w:t xml:space="preserve"> Используется для локальных сетей (</w:t>
       </w:r>
       <w:proofErr w:type="spellStart"/>
       <w:r>
@@ -3134,6 +3081,19 @@
       <w:r>
         <w:t xml:space="preserve"> Самое критичное поле! Это технический идентификатор нейросети на сервере.</w:t>
       </w:r>
+      <w:r>
+        <w:t xml:space="preserve"> </w:t>
+      </w:r>
+      <w:r>
+        <w:rPr>
+          <w:b/>
+          <w:bCs/>
+        </w:rPr>
+        <w:t>Обязательно указывайте с маленькой буквы!</w:t>
+      </w:r>
+      <w:r>
+        <w:t xml:space="preserve"> </w:t>
+      </w:r>
     </w:p>
     <w:p>
       <w:pPr>
@@ -3287,22 +3247,10 @@
           <w:b/>
           <w:bCs/>
         </w:rPr>
-        <w:t>)</w:t>
-      </w:r>
-      <w:proofErr w:type="gramStart"/>
-      <w:r>
-        <w:rPr>
-          <w:b/>
-          <w:bCs/>
-        </w:rPr>
-        <w:t>:</w:t>
-      </w:r>
-      <w:r>
-        <w:t xml:space="preserve"> Строго</w:t>
-      </w:r>
-      <w:proofErr w:type="gramEnd"/>
-      <w:r>
-        <w:t xml:space="preserve"> по документации провайдера (например, </w:t>
+        <w:t>):</w:t>
+      </w:r>
+      <w:r>
+        <w:t xml:space="preserve"> Строго по документации провайдера (например, </w:t>
       </w:r>
       <w:r>
         <w:rPr>
@@ -3442,14 +3390,23 @@
           <w:rFonts w:ascii="Times New Roman" w:hAnsi="Times New Roman" w:cs="Times New Roman"/>
         </w:rPr>
       </w:pPr>
-      <w:proofErr w:type="spellStart"/>
-      <w:r>
-        <w:rPr>
-          <w:rFonts w:ascii="Times New Roman" w:hAnsi="Times New Roman" w:cs="Times New Roman"/>
-          <w:b/>
-          <w:bCs/>
-        </w:rPr>
-        <w:t>Ollama</w:t>
+      <w:r>
+        <w:rPr>
+          <w:rFonts w:ascii="Times New Roman" w:hAnsi="Times New Roman" w:cs="Times New Roman"/>
+          <w:b/>
+          <w:bCs/>
+          <w:lang w:val="en-US"/>
+        </w:rPr>
+        <w:t>o</w:t>
+      </w:r>
+      <w:proofErr w:type="spellStart"/>
+      <w:r>
+        <w:rPr>
+          <w:rFonts w:ascii="Times New Roman" w:hAnsi="Times New Roman" w:cs="Times New Roman"/>
+          <w:b/>
+          <w:bCs/>
+        </w:rPr>
+        <w:t>llama</w:t>
       </w:r>
       <w:proofErr w:type="spellEnd"/>
       <w:r>
@@ -3566,15 +3523,24 @@
           <w:rFonts w:ascii="Times New Roman" w:hAnsi="Times New Roman" w:cs="Times New Roman"/>
         </w:rPr>
       </w:pPr>
-      <w:proofErr w:type="spellStart"/>
-      <w:r>
-        <w:rPr>
-          <w:rFonts w:ascii="Times New Roman" w:hAnsi="Times New Roman" w:cs="Times New Roman"/>
-          <w:b/>
-          <w:bCs/>
+      <w:r>
+        <w:rPr>
+          <w:rFonts w:ascii="Times New Roman" w:hAnsi="Times New Roman" w:cs="Times New Roman"/>
+          <w:b/>
+          <w:bCs/>
+          <w:lang w:val="en-US"/>
         </w:rPr>
         <w:lastRenderedPageBreak/>
-        <w:t>Groq</w:t>
+        <w:t>g</w:t>
+      </w:r>
+      <w:proofErr w:type="spellStart"/>
+      <w:r>
+        <w:rPr>
+          <w:rFonts w:ascii="Times New Roman" w:hAnsi="Times New Roman" w:cs="Times New Roman"/>
+          <w:b/>
+          <w:bCs/>
+        </w:rPr>
+        <w:t>roq</w:t>
       </w:r>
       <w:proofErr w:type="spellEnd"/>
       <w:r>
@@ -3616,14 +3582,23 @@
           <w:rFonts w:ascii="Times New Roman" w:hAnsi="Times New Roman" w:cs="Times New Roman"/>
         </w:rPr>
       </w:pPr>
-      <w:proofErr w:type="spellStart"/>
-      <w:r>
-        <w:rPr>
-          <w:rFonts w:ascii="Times New Roman" w:hAnsi="Times New Roman" w:cs="Times New Roman"/>
-          <w:b/>
-          <w:bCs/>
-        </w:rPr>
-        <w:t>YandexGPT</w:t>
+      <w:r>
+        <w:rPr>
+          <w:rFonts w:ascii="Times New Roman" w:hAnsi="Times New Roman" w:cs="Times New Roman"/>
+          <w:b/>
+          <w:bCs/>
+          <w:lang w:val="en-US"/>
+        </w:rPr>
+        <w:t>y</w:t>
+      </w:r>
+      <w:proofErr w:type="spellStart"/>
+      <w:r>
+        <w:rPr>
+          <w:rFonts w:ascii="Times New Roman" w:hAnsi="Times New Roman" w:cs="Times New Roman"/>
+          <w:b/>
+          <w:bCs/>
+        </w:rPr>
+        <w:t>andexGPT</w:t>
       </w:r>
       <w:proofErr w:type="spellEnd"/>
       <w:r>
@@ -3948,29 +3923,13 @@
           <w:b/>
           <w:bCs/>
         </w:rPr>
-        <w:t xml:space="preserve"> API (Бесплатно / Дешево)</w:t>
-      </w:r>
-      <w:proofErr w:type="gramStart"/>
-      <w:r>
-        <w:rPr>
-          <w:rFonts w:ascii="Times New Roman" w:hAnsi="Times New Roman" w:cs="Times New Roman"/>
-          <w:b/>
-          <w:bCs/>
-        </w:rPr>
-        <w:t>:</w:t>
-      </w:r>
-      <w:r>
-        <w:rPr>
-          <w:rFonts w:ascii="Times New Roman" w:hAnsi="Times New Roman" w:cs="Times New Roman"/>
-        </w:rPr>
-        <w:t xml:space="preserve"> Предлагает</w:t>
-      </w:r>
-      <w:proofErr w:type="gramEnd"/>
-      <w:r>
-        <w:rPr>
-          <w:rFonts w:ascii="Times New Roman" w:hAnsi="Times New Roman" w:cs="Times New Roman"/>
-        </w:rPr>
-        <w:t xml:space="preserve"> аппаратное ускорение на LPU. Предоставляет доступ к тяжелой модели Llama-3-70B. Выдает результат мгновенно (до 800 слов в секунду), что идеально для объемных аудитов, однако требует VPN на территории РФ.</w:t>
+        <w:t xml:space="preserve"> API (Бесплатно / Дешево):</w:t>
+      </w:r>
+      <w:r>
+        <w:rPr>
+          <w:rFonts w:ascii="Times New Roman" w:hAnsi="Times New Roman" w:cs="Times New Roman"/>
+        </w:rPr>
+        <w:t xml:space="preserve"> Предлагает аппаратное ускорение на LPU. Предоставляет доступ к тяжелой модели Llama-3-70B. Выдает результат мгновенно (до 800 слов в секунду), что идеально для объемных аудитов, однако требует VPN на территории РФ.</w:t>
       </w:r>
     </w:p>
     <w:p>
@@ -4046,7 +4005,6 @@
         <w:t>YandexGPT</w:t>
       </w:r>
       <w:proofErr w:type="spellEnd"/>
-      <w:proofErr w:type="gramStart"/>
       <w:r>
         <w:rPr>
           <w:rFonts w:ascii="Times New Roman" w:hAnsi="Times New Roman" w:cs="Times New Roman"/>
@@ -4059,14 +4017,7 @@
         <w:rPr>
           <w:rFonts w:ascii="Times New Roman" w:hAnsi="Times New Roman" w:cs="Times New Roman"/>
         </w:rPr>
-        <w:t xml:space="preserve"> Отлично</w:t>
-      </w:r>
-      <w:proofErr w:type="gramEnd"/>
-      <w:r>
-        <w:rPr>
-          <w:rFonts w:ascii="Times New Roman" w:hAnsi="Times New Roman" w:cs="Times New Roman"/>
-        </w:rPr>
-        <w:t xml:space="preserve"> работает с длинными русскоязычными контекстами. Имеет удобную тарификацию за тысячу токенов.</w:t>
+        <w:t xml:space="preserve"> Отлично работает с длинными русскоязычными контекстами. Имеет удобную тарификацию за тысячу токенов.</w:t>
       </w:r>
     </w:p>
     <w:p>
@@ -4588,17 +4539,9 @@
               <w:rPr>
                 <w:rFonts w:ascii="Times New Roman" w:hAnsi="Times New Roman" w:cs="Times New Roman"/>
               </w:rPr>
-              <w:t>llm_</w:t>
-            </w:r>
-            <w:proofErr w:type="gramStart"/>
-            <w:r>
-              <w:rPr>
-                <w:rFonts w:ascii="Times New Roman" w:hAnsi="Times New Roman" w:cs="Times New Roman"/>
-              </w:rPr>
-              <w:t>providers.json</w:t>
+              <w:t>llm_providers.json</w:t>
             </w:r>
             <w:proofErr w:type="spellEnd"/>
-            <w:proofErr w:type="gramEnd"/>
             <w:r>
               <w:rPr>
                 <w:rFonts w:ascii="Times New Roman" w:hAnsi="Times New Roman" w:cs="Times New Roman"/>

</xml_diff>